<commit_message>
Add code for exercise 3
</commit_message>
<xml_diff>
--- a/Students/Answer_sheet.docx
+++ b/Students/Answer_sheet.docx
@@ -126,15 +126,30 @@
         </w:rPr>
         <w:t>:</w:t>
       </w:r>
-    </w:p>
-    <w:p>
-      <w:pPr>
-        <w:rPr>
-          <w:rFonts w:ascii="Times New Roman" w:hAnsi="Times New Roman" w:cs="Times New Roman"/>
-          <w:sz w:val="32"/>
-          <w:szCs w:val="32"/>
-        </w:rPr>
-      </w:pPr>
+      <w:r>
+        <w:rPr>
+          <w:rFonts w:ascii="Times New Roman" w:hAnsi="Times New Roman" w:cs="Times New Roman"/>
+          <w:b/>
+          <w:bCs/>
+          <w:sz w:val="36"/>
+          <w:szCs w:val="36"/>
+          <w:u w:val="single"/>
+        </w:rPr>
+        <w:t xml:space="preserve"> </w:t>
+      </w:r>
+    </w:p>
+    <w:p>
+      <w:hyperlink r:id="rId8" w:history="1">
+        <w:r>
+          <w:rPr>
+            <w:rStyle w:val="Hyperlink"/>
+          </w:rPr>
+          <w:t>https://github.com/c-khoo/ENSF381-lab04.git</w:t>
+        </w:r>
+      </w:hyperlink>
+      <w:r>
+        <w:t xml:space="preserve"> </w:t>
+      </w:r>
     </w:p>
     <w:p>
       <w:pPr>
@@ -199,28 +214,51 @@
         <w:rPr>
           <w:rFonts w:ascii="Times New Roman" w:hAnsi="Times New Roman" w:cs="Times New Roman"/>
         </w:rPr>
-        <w:t>Name 1 (UCID#)</w:t>
-      </w:r>
-    </w:p>
-    <w:p>
-      <w:pPr>
-        <w:rPr>
-          <w:rFonts w:ascii="Times New Roman" w:hAnsi="Times New Roman" w:cs="Times New Roman"/>
-        </w:rPr>
-      </w:pPr>
-      <w:r>
-        <w:rPr>
-          <w:rFonts w:ascii="Times New Roman" w:hAnsi="Times New Roman" w:cs="Times New Roman"/>
-        </w:rPr>
-        <w:t>Name 2 (UCID#)</w:t>
-      </w:r>
-    </w:p>
-    <w:p>
-      <w:pPr>
-        <w:rPr>
-          <w:rFonts w:ascii="Times New Roman" w:hAnsi="Times New Roman" w:cs="Times New Roman"/>
-        </w:rPr>
-      </w:pPr>
+        <w:t>Chloe Khoo</w:t>
+      </w:r>
+      <w:r>
+        <w:rPr>
+          <w:rFonts w:ascii="Times New Roman" w:hAnsi="Times New Roman" w:cs="Times New Roman"/>
+        </w:rPr>
+        <w:t xml:space="preserve"> (</w:t>
+      </w:r>
+      <w:r>
+        <w:rPr>
+          <w:rFonts w:ascii="Times New Roman" w:hAnsi="Times New Roman" w:cs="Times New Roman"/>
+        </w:rPr>
+        <w:t>30247640)</w:t>
+      </w:r>
+    </w:p>
+    <w:p>
+      <w:pPr>
+        <w:rPr>
+          <w:rFonts w:ascii="Times New Roman" w:hAnsi="Times New Roman" w:cs="Times New Roman"/>
+        </w:rPr>
+      </w:pPr>
+      <w:r>
+        <w:rPr>
+          <w:rFonts w:ascii="Times New Roman" w:hAnsi="Times New Roman" w:cs="Times New Roman"/>
+        </w:rPr>
+        <w:t>Nayha Rehman</w:t>
+      </w:r>
+      <w:r>
+        <w:rPr>
+          <w:rFonts w:ascii="Times New Roman" w:hAnsi="Times New Roman" w:cs="Times New Roman"/>
+        </w:rPr>
+        <w:t xml:space="preserve"> (</w:t>
+      </w:r>
+      <w:r>
+        <w:rPr>
+          <w:rFonts w:ascii="Times New Roman" w:hAnsi="Times New Roman" w:cs="Times New Roman"/>
+        </w:rPr>
+        <w:t>30250126</w:t>
+      </w:r>
+      <w:r>
+        <w:rPr>
+          <w:rFonts w:ascii="Times New Roman" w:hAnsi="Times New Roman" w:cs="Times New Roman"/>
+        </w:rPr>
+        <w:t>)</w:t>
+      </w:r>
     </w:p>
     <w:p>
       <w:pPr>
@@ -248,6 +286,102 @@
           <w:color w:val="000000" w:themeColor="text1"/>
           <w:u w:val="single"/>
         </w:rPr>
+        <w:t xml:space="preserve">Exercise </w:t>
+      </w:r>
+      <w:r>
+        <w:rPr>
+          <w:rFonts w:ascii="Times New Roman" w:hAnsi="Times New Roman" w:cs="Times New Roman"/>
+          <w:b/>
+          <w:bCs/>
+          <w:color w:val="000000" w:themeColor="text1"/>
+          <w:u w:val="single"/>
+        </w:rPr>
+        <w:t>1</w:t>
+      </w:r>
+      <w:r>
+        <w:rPr>
+          <w:rFonts w:ascii="Times New Roman" w:hAnsi="Times New Roman" w:cs="Times New Roman"/>
+          <w:b/>
+          <w:bCs/>
+          <w:color w:val="000000" w:themeColor="text1"/>
+          <w:u w:val="single"/>
+        </w:rPr>
+        <w:t>:</w:t>
+      </w:r>
+    </w:p>
+    <w:p>
+      <w:pPr>
+        <w:rPr>
+          <w:rFonts w:ascii="Times New Roman" w:hAnsi="Times New Roman" w:cs="Times New Roman"/>
+        </w:rPr>
+      </w:pPr>
+    </w:p>
+    <w:p>
+      <w:pPr>
+        <w:rPr>
+          <w:rFonts w:ascii="Times New Roman" w:hAnsi="Times New Roman" w:cs="Times New Roman"/>
+        </w:rPr>
+      </w:pPr>
+      <w:r>
+        <w:rPr>
+          <w:rFonts w:ascii="Times New Roman" w:hAnsi="Times New Roman" w:cs="Times New Roman"/>
+        </w:rPr>
+        <w:drawing>
+          <wp:inline distT="0" distB="0" distL="0" distR="0" wp14:anchorId="2F316646" wp14:editId="45AA8138">
+            <wp:extent cx="5943600" cy="976630"/>
+            <wp:effectExtent l="0" t="0" r="0" b="0"/>
+            <wp:docPr id="1636172053" name="Picture 1"/>
+            <wp:cNvGraphicFramePr>
+              <a:graphicFrameLocks xmlns:a="http://schemas.openxmlformats.org/drawingml/2006/main" noChangeAspect="1"/>
+            </wp:cNvGraphicFramePr>
+            <a:graphic xmlns:a="http://schemas.openxmlformats.org/drawingml/2006/main">
+              <a:graphicData uri="http://schemas.openxmlformats.org/drawingml/2006/picture">
+                <pic:pic xmlns:pic="http://schemas.openxmlformats.org/drawingml/2006/picture">
+                  <pic:nvPicPr>
+                    <pic:cNvPr id="1636172053" name=""/>
+                    <pic:cNvPicPr/>
+                  </pic:nvPicPr>
+                  <pic:blipFill>
+                    <a:blip r:embed="rId9"/>
+                    <a:stretch>
+                      <a:fillRect/>
+                    </a:stretch>
+                  </pic:blipFill>
+                  <pic:spPr>
+                    <a:xfrm>
+                      <a:off x="0" y="0"/>
+                      <a:ext cx="5943600" cy="976630"/>
+                    </a:xfrm>
+                    <a:prstGeom prst="rect">
+                      <a:avLst/>
+                    </a:prstGeom>
+                  </pic:spPr>
+                </pic:pic>
+              </a:graphicData>
+            </a:graphic>
+          </wp:inline>
+        </w:drawing>
+      </w:r>
+    </w:p>
+    <w:p>
+      <w:pPr>
+        <w:pStyle w:val="Heading2"/>
+        <w:rPr>
+          <w:rFonts w:ascii="Times New Roman" w:hAnsi="Times New Roman" w:cs="Times New Roman"/>
+          <w:b/>
+          <w:bCs/>
+          <w:color w:val="000000" w:themeColor="text1"/>
+          <w:u w:val="single"/>
+        </w:rPr>
+      </w:pPr>
+      <w:r>
+        <w:rPr>
+          <w:rFonts w:ascii="Times New Roman" w:hAnsi="Times New Roman" w:cs="Times New Roman"/>
+          <w:b/>
+          <w:bCs/>
+          <w:color w:val="000000" w:themeColor="text1"/>
+          <w:u w:val="single"/>
+        </w:rPr>
         <w:t>Exercise 2:</w:t>
       </w:r>
     </w:p>
@@ -293,17 +427,62 @@
           <w:szCs w:val="28"/>
         </w:rPr>
       </w:pPr>
-    </w:p>
-    <w:p>
-      <w:pPr>
-        <w:rPr>
-          <w:rFonts w:ascii="Times New Roman" w:hAnsi="Times New Roman" w:cs="Times New Roman"/>
-          <w:b/>
-          <w:bCs/>
+      <w:r>
+        <w:rPr>
+          <w:rFonts w:ascii="Times New Roman" w:hAnsi="Times New Roman" w:cs="Times New Roman"/>
+          <w:b/>
+          <w:bCs/>
+          <w:noProof/>
           <w:sz w:val="28"/>
           <w:szCs w:val="28"/>
         </w:rPr>
-      </w:pPr>
+        <w:lastRenderedPageBreak/>
+        <w:drawing>
+          <wp:inline distT="0" distB="0" distL="0" distR="0" wp14:anchorId="75BB6D9E" wp14:editId="7862036F">
+            <wp:extent cx="5623560" cy="5768431"/>
+            <wp:effectExtent l="0" t="0" r="0" b="3810"/>
+            <wp:docPr id="143574145" name="Picture 4"/>
+            <wp:cNvGraphicFramePr>
+              <a:graphicFrameLocks xmlns:a="http://schemas.openxmlformats.org/drawingml/2006/main" noChangeAspect="1"/>
+            </wp:cNvGraphicFramePr>
+            <a:graphic xmlns:a="http://schemas.openxmlformats.org/drawingml/2006/main">
+              <a:graphicData uri="http://schemas.openxmlformats.org/drawingml/2006/picture">
+                <pic:pic xmlns:pic="http://schemas.openxmlformats.org/drawingml/2006/picture">
+                  <pic:nvPicPr>
+                    <pic:cNvPr id="0" name="Picture 2"/>
+                    <pic:cNvPicPr>
+                      <a:picLocks noChangeAspect="1" noChangeArrowheads="1"/>
+                    </pic:cNvPicPr>
+                  </pic:nvPicPr>
+                  <pic:blipFill>
+                    <a:blip r:embed="rId10">
+                      <a:extLst>
+                        <a:ext uri="{28A0092B-C50C-407E-A947-70E740481C1C}">
+                          <a14:useLocalDpi xmlns:a14="http://schemas.microsoft.com/office/drawing/2010/main" val="0"/>
+                        </a:ext>
+                      </a:extLst>
+                    </a:blip>
+                    <a:srcRect/>
+                    <a:stretch>
+                      <a:fillRect/>
+                    </a:stretch>
+                  </pic:blipFill>
+                  <pic:spPr bwMode="auto">
+                    <a:xfrm>
+                      <a:off x="0" y="0"/>
+                      <a:ext cx="5648663" cy="5794180"/>
+                    </a:xfrm>
+                    <a:prstGeom prst="rect">
+                      <a:avLst/>
+                    </a:prstGeom>
+                    <a:noFill/>
+                  </pic:spPr>
+                </pic:pic>
+              </a:graphicData>
+            </a:graphic>
+          </wp:inline>
+        </w:drawing>
+      </w:r>
     </w:p>
     <w:p>
       <w:pPr>
@@ -315,7 +494,9 @@
           <w:szCs w:val="28"/>
         </w:rPr>
       </w:pPr>
-      <w:r>
+    </w:p>
+    <w:p>
+      <w:pPr>
         <w:rPr>
           <w:rFonts w:ascii="Times New Roman" w:hAnsi="Times New Roman" w:cs="Times New Roman"/>
           <w:b/>
@@ -323,11 +504,8 @@
           <w:sz w:val="28"/>
           <w:szCs w:val="28"/>
         </w:rPr>
-        <w:t>Screenshot from Step 12:</w:t>
-      </w:r>
-    </w:p>
-    <w:p>
-      <w:pPr>
+      </w:pPr>
+      <w:r>
         <w:rPr>
           <w:rFonts w:ascii="Times New Roman" w:hAnsi="Times New Roman" w:cs="Times New Roman"/>
           <w:b/>
@@ -335,7 +513,8 @@
           <w:sz w:val="28"/>
           <w:szCs w:val="28"/>
         </w:rPr>
-      </w:pPr>
+        <w:t>Screenshot from Step 12:</w:t>
+      </w:r>
     </w:p>
     <w:p>
       <w:pPr>
@@ -347,9 +526,7 @@
           <w:szCs w:val="28"/>
         </w:rPr>
       </w:pPr>
-    </w:p>
-    <w:p>
-      <w:pPr>
+      <w:r>
         <w:rPr>
           <w:rFonts w:ascii="Times New Roman" w:hAnsi="Times New Roman" w:cs="Times New Roman"/>
           <w:b/>
@@ -357,8 +534,51 @@
           <w:sz w:val="28"/>
           <w:szCs w:val="28"/>
         </w:rPr>
-      </w:pPr>
-      <w:r>
+        <w:drawing>
+          <wp:inline distT="0" distB="0" distL="0" distR="0" wp14:anchorId="4FEC0F6F" wp14:editId="190951B3">
+            <wp:extent cx="3820332" cy="1329769"/>
+            <wp:effectExtent l="0" t="0" r="8890" b="3810"/>
+            <wp:docPr id="598282744" name="Picture 1" descr="The image displays a screenshot from the MockAPI.io platform, showcasing an API endpoint page with a user interface for creating, editing, and managing resources, such as a users API endpoint.&#10;&#10;AI-generated content may be incorrect.">
+              <a:extLst xmlns:a="http://schemas.openxmlformats.org/drawingml/2006/main">
+                <a:ext uri="{FF2B5EF4-FFF2-40B4-BE49-F238E27FC236}">
+                  <a16:creationId xmlns:a16="http://schemas.microsoft.com/office/drawing/2014/main" id="{045839F9-508D-4894-BA05-88DAADB8AE5D}"/>
+                </a:ext>
+              </a:extLst>
+            </wp:docPr>
+            <wp:cNvGraphicFramePr>
+              <a:graphicFrameLocks xmlns:a="http://schemas.openxmlformats.org/drawingml/2006/main" noChangeAspect="1"/>
+            </wp:cNvGraphicFramePr>
+            <a:graphic xmlns:a="http://schemas.openxmlformats.org/drawingml/2006/main">
+              <a:graphicData uri="http://schemas.openxmlformats.org/drawingml/2006/picture">
+                <pic:pic xmlns:pic="http://schemas.openxmlformats.org/drawingml/2006/picture">
+                  <pic:nvPicPr>
+                    <pic:cNvPr id="598282744" name="Picture 1" descr="The image displays a screenshot from the MockAPI.io platform, showcasing an API endpoint page with a user interface for creating, editing, and managing resources, such as a users API endpoint.&#10;&#10;AI-generated content may be incorrect."/>
+                    <pic:cNvPicPr/>
+                  </pic:nvPicPr>
+                  <pic:blipFill>
+                    <a:blip r:embed="rId11"/>
+                    <a:stretch>
+                      <a:fillRect/>
+                    </a:stretch>
+                  </pic:blipFill>
+                  <pic:spPr>
+                    <a:xfrm>
+                      <a:off x="0" y="0"/>
+                      <a:ext cx="3829537" cy="1332973"/>
+                    </a:xfrm>
+                    <a:prstGeom prst="rect">
+                      <a:avLst/>
+                    </a:prstGeom>
+                  </pic:spPr>
+                </pic:pic>
+              </a:graphicData>
+            </a:graphic>
+          </wp:inline>
+        </w:drawing>
+      </w:r>
+    </w:p>
+    <w:p>
+      <w:pPr>
         <w:rPr>
           <w:rFonts w:ascii="Times New Roman" w:hAnsi="Times New Roman" w:cs="Times New Roman"/>
           <w:b/>
@@ -366,9 +586,10 @@
           <w:sz w:val="28"/>
           <w:szCs w:val="28"/>
         </w:rPr>
-        <w:t>Screenshot from Step 1</w:t>
-      </w:r>
-      <w:r>
+      </w:pPr>
+    </w:p>
+    <w:p>
+      <w:pPr>
         <w:rPr>
           <w:rFonts w:ascii="Times New Roman" w:hAnsi="Times New Roman" w:cs="Times New Roman"/>
           <w:b/>
@@ -376,8 +597,7 @@
           <w:sz w:val="28"/>
           <w:szCs w:val="28"/>
         </w:rPr>
-        <w:t>4</w:t>
-      </w:r>
+      </w:pPr>
       <w:r>
         <w:rPr>
           <w:rFonts w:ascii="Times New Roman" w:hAnsi="Times New Roman" w:cs="Times New Roman"/>
@@ -386,11 +606,9 @@
           <w:sz w:val="28"/>
           <w:szCs w:val="28"/>
         </w:rPr>
-        <w:t xml:space="preserve">: </w:t>
-      </w:r>
-    </w:p>
-    <w:p>
-      <w:pPr>
+        <w:t>Screenshot from Step 1</w:t>
+      </w:r>
+      <w:r>
         <w:rPr>
           <w:rFonts w:ascii="Times New Roman" w:hAnsi="Times New Roman" w:cs="Times New Roman"/>
           <w:b/>
@@ -398,10 +616,9 @@
           <w:sz w:val="28"/>
           <w:szCs w:val="28"/>
         </w:rPr>
-      </w:pPr>
-    </w:p>
-    <w:p>
-      <w:pPr>
+        <w:t>4</w:t>
+      </w:r>
+      <w:r>
         <w:rPr>
           <w:rFonts w:ascii="Times New Roman" w:hAnsi="Times New Roman" w:cs="Times New Roman"/>
           <w:b/>
@@ -409,7 +626,8 @@
           <w:sz w:val="28"/>
           <w:szCs w:val="28"/>
         </w:rPr>
-      </w:pPr>
+        <w:t xml:space="preserve">: </w:t>
+      </w:r>
     </w:p>
     <w:p>
       <w:pPr>
@@ -421,9 +639,7 @@
           <w:szCs w:val="28"/>
         </w:rPr>
       </w:pPr>
-    </w:p>
-    <w:p>
-      <w:pPr>
+      <w:r>
         <w:rPr>
           <w:rFonts w:ascii="Times New Roman" w:hAnsi="Times New Roman" w:cs="Times New Roman"/>
           <w:b/>
@@ -431,6 +647,81 @@
           <w:sz w:val="28"/>
           <w:szCs w:val="28"/>
         </w:rPr>
+        <w:lastRenderedPageBreak/>
+        <w:drawing>
+          <wp:inline distT="0" distB="0" distL="0" distR="0" wp14:anchorId="4FFABD52" wp14:editId="71D4D110">
+            <wp:extent cx="6053917" cy="1224366"/>
+            <wp:effectExtent l="0" t="0" r="4445" b="0"/>
+            <wp:docPr id="524747429" name="Picture 2" descr="A table listing user names, their assigned user groups, and unique IDs.&#10;&#10;AI-generated content may be incorrect.">
+              <a:extLst xmlns:a="http://schemas.openxmlformats.org/drawingml/2006/main">
+                <a:ext uri="{FF2B5EF4-FFF2-40B4-BE49-F238E27FC236}">
+                  <a16:creationId xmlns:a16="http://schemas.microsoft.com/office/drawing/2014/main" id="{F5394EB0-8185-449E-9FA9-7171697A9999}"/>
+                </a:ext>
+              </a:extLst>
+            </wp:docPr>
+            <wp:cNvGraphicFramePr>
+              <a:graphicFrameLocks xmlns:a="http://schemas.openxmlformats.org/drawingml/2006/main" noChangeAspect="1"/>
+            </wp:cNvGraphicFramePr>
+            <a:graphic xmlns:a="http://schemas.openxmlformats.org/drawingml/2006/main">
+              <a:graphicData uri="http://schemas.openxmlformats.org/drawingml/2006/picture">
+                <pic:pic xmlns:pic="http://schemas.openxmlformats.org/drawingml/2006/picture">
+                  <pic:nvPicPr>
+                    <pic:cNvPr id="524747429" name="Picture 2" descr="A table listing user names, their assigned user groups, and unique IDs.&#10;&#10;AI-generated content may be incorrect."/>
+                    <pic:cNvPicPr/>
+                  </pic:nvPicPr>
+                  <pic:blipFill>
+                    <a:blip r:embed="rId12"/>
+                    <a:stretch>
+                      <a:fillRect/>
+                    </a:stretch>
+                  </pic:blipFill>
+                  <pic:spPr>
+                    <a:xfrm>
+                      <a:off x="0" y="0"/>
+                      <a:ext cx="6095764" cy="1232829"/>
+                    </a:xfrm>
+                    <a:prstGeom prst="rect">
+                      <a:avLst/>
+                    </a:prstGeom>
+                  </pic:spPr>
+                </pic:pic>
+              </a:graphicData>
+            </a:graphic>
+          </wp:inline>
+        </w:drawing>
+      </w:r>
+    </w:p>
+    <w:p>
+      <w:pPr>
+        <w:rPr>
+          <w:rFonts w:ascii="Times New Roman" w:hAnsi="Times New Roman" w:cs="Times New Roman"/>
+          <w:b/>
+          <w:bCs/>
+          <w:sz w:val="28"/>
+          <w:szCs w:val="28"/>
+        </w:rPr>
+      </w:pPr>
+    </w:p>
+    <w:p>
+      <w:pPr>
+        <w:rPr>
+          <w:rFonts w:ascii="Times New Roman" w:hAnsi="Times New Roman" w:cs="Times New Roman"/>
+          <w:b/>
+          <w:bCs/>
+          <w:sz w:val="28"/>
+          <w:szCs w:val="28"/>
+        </w:rPr>
+      </w:pPr>
+    </w:p>
+    <w:p>
+      <w:pPr>
+        <w:rPr>
+          <w:rFonts w:ascii="Times New Roman" w:hAnsi="Times New Roman" w:cs="Times New Roman"/>
+          <w:b/>
+          <w:bCs/>
+          <w:sz w:val="28"/>
+          <w:szCs w:val="28"/>
+        </w:rPr>
       </w:pPr>
     </w:p>
     <w:p>
@@ -461,6 +752,127 @@
           <w:rFonts w:ascii="Times New Roman" w:hAnsi="Times New Roman" w:cs="Times New Roman"/>
         </w:rPr>
       </w:pPr>
+      <w:r>
+        <w:rPr>
+          <w:rFonts w:ascii="Times New Roman" w:hAnsi="Times New Roman" w:cs="Times New Roman"/>
+        </w:rPr>
+        <w:t>*</w:t>
+      </w:r>
+      <w:r>
+        <w:rPr>
+          <w:rFonts w:ascii="Times New Roman" w:hAnsi="Times New Roman" w:cs="Times New Roman"/>
+        </w:rPr>
+        <w:t>NOTE</w:t>
+      </w:r>
+      <w:r>
+        <w:rPr>
+          <w:rFonts w:ascii="Times New Roman" w:hAnsi="Times New Roman" w:cs="Times New Roman"/>
+        </w:rPr>
+        <w:t>: Scr</w:t>
+      </w:r>
+      <w:r>
+        <w:rPr>
+          <w:rFonts w:ascii="Times New Roman" w:hAnsi="Times New Roman" w:cs="Times New Roman"/>
+        </w:rPr>
+        <w:t>eenshot</w:t>
+      </w:r>
+      <w:r>
+        <w:rPr>
+          <w:rFonts w:ascii="Times New Roman" w:hAnsi="Times New Roman" w:cs="Times New Roman"/>
+        </w:rPr>
+        <w:t xml:space="preserve">s were </w:t>
+      </w:r>
+      <w:r>
+        <w:rPr>
+          <w:rFonts w:ascii="Times New Roman" w:hAnsi="Times New Roman" w:cs="Times New Roman"/>
+        </w:rPr>
+        <w:t>take</w:t>
+      </w:r>
+      <w:r>
+        <w:rPr>
+          <w:rFonts w:ascii="Times New Roman" w:hAnsi="Times New Roman" w:cs="Times New Roman"/>
+        </w:rPr>
+        <w:t>n AFTER</w:t>
+      </w:r>
+      <w:r>
+        <w:rPr>
+          <w:rFonts w:ascii="Times New Roman" w:hAnsi="Times New Roman" w:cs="Times New Roman"/>
+        </w:rPr>
+        <w:t xml:space="preserve"> </w:t>
+      </w:r>
+      <w:r>
+        <w:rPr>
+          <w:rFonts w:ascii="Times New Roman" w:hAnsi="Times New Roman" w:cs="Times New Roman"/>
+        </w:rPr>
+        <w:t>all ste</w:t>
+      </w:r>
+      <w:r>
+        <w:rPr>
+          <w:rFonts w:ascii="Times New Roman" w:hAnsi="Times New Roman" w:cs="Times New Roman"/>
+        </w:rPr>
+        <w:t xml:space="preserve">ps were </w:t>
+      </w:r>
+      <w:r>
+        <w:rPr>
+          <w:rFonts w:ascii="Times New Roman" w:hAnsi="Times New Roman" w:cs="Times New Roman"/>
+        </w:rPr>
+        <w:t>complet</w:t>
+      </w:r>
+      <w:r>
+        <w:rPr>
+          <w:rFonts w:ascii="Times New Roman" w:hAnsi="Times New Roman" w:cs="Times New Roman"/>
+        </w:rPr>
+        <w:t xml:space="preserve">ed and </w:t>
+      </w:r>
+      <w:r>
+        <w:rPr>
+          <w:rFonts w:ascii="Times New Roman" w:hAnsi="Times New Roman" w:cs="Times New Roman"/>
+        </w:rPr>
+        <w:t>tes</w:t>
+      </w:r>
+      <w:r>
+        <w:rPr>
+          <w:rFonts w:ascii="Times New Roman" w:hAnsi="Times New Roman" w:cs="Times New Roman"/>
+        </w:rPr>
+        <w:t>ting data</w:t>
+      </w:r>
+      <w:r>
+        <w:rPr>
+          <w:rFonts w:ascii="Times New Roman" w:hAnsi="Times New Roman" w:cs="Times New Roman"/>
+        </w:rPr>
+        <w:t xml:space="preserve"> deleti</w:t>
+      </w:r>
+      <w:r>
+        <w:rPr>
+          <w:rFonts w:ascii="Times New Roman" w:hAnsi="Times New Roman" w:cs="Times New Roman"/>
+        </w:rPr>
+        <w:t xml:space="preserve">on </w:t>
+      </w:r>
+      <w:r>
+        <w:rPr>
+          <w:rFonts w:ascii="Times New Roman" w:hAnsi="Times New Roman" w:cs="Times New Roman"/>
+        </w:rPr>
+        <w:t xml:space="preserve">was </w:t>
+      </w:r>
+      <w:r>
+        <w:rPr>
+          <w:rFonts w:ascii="Times New Roman" w:hAnsi="Times New Roman" w:cs="Times New Roman"/>
+        </w:rPr>
+        <w:t>don</w:t>
+      </w:r>
+      <w:r>
+        <w:rPr>
+          <w:rFonts w:ascii="Times New Roman" w:hAnsi="Times New Roman" w:cs="Times New Roman"/>
+        </w:rPr>
+        <w:t>e.</w:t>
+      </w:r>
+    </w:p>
+    <w:p>
+      <w:pPr>
+        <w:rPr>
+          <w:rFonts w:ascii="Times New Roman" w:hAnsi="Times New Roman" w:cs="Times New Roman"/>
+        </w:rPr>
+      </w:pPr>
     </w:p>
     <w:p>
       <w:pPr>
@@ -485,6 +897,46 @@
           <w:rFonts w:ascii="Times New Roman" w:hAnsi="Times New Roman" w:cs="Times New Roman"/>
         </w:rPr>
       </w:pPr>
+      <w:r>
+        <w:rPr>
+          <w:rFonts w:ascii="Times New Roman" w:hAnsi="Times New Roman" w:cs="Times New Roman"/>
+        </w:rPr>
+        <w:drawing>
+          <wp:inline distT="0" distB="0" distL="0" distR="0" wp14:anchorId="579A0B98" wp14:editId="7B647A1F">
+            <wp:extent cx="5943600" cy="4883150"/>
+            <wp:effectExtent l="0" t="0" r="0" b="0"/>
+            <wp:docPr id="217436095" name="Picture 1"/>
+            <wp:cNvGraphicFramePr>
+              <a:graphicFrameLocks xmlns:a="http://schemas.openxmlformats.org/drawingml/2006/main" noChangeAspect="1"/>
+            </wp:cNvGraphicFramePr>
+            <a:graphic xmlns:a="http://schemas.openxmlformats.org/drawingml/2006/main">
+              <a:graphicData uri="http://schemas.openxmlformats.org/drawingml/2006/picture">
+                <pic:pic xmlns:pic="http://schemas.openxmlformats.org/drawingml/2006/picture">
+                  <pic:nvPicPr>
+                    <pic:cNvPr id="217436095" name=""/>
+                    <pic:cNvPicPr/>
+                  </pic:nvPicPr>
+                  <pic:blipFill>
+                    <a:blip r:embed="rId13"/>
+                    <a:stretch>
+                      <a:fillRect/>
+                    </a:stretch>
+                  </pic:blipFill>
+                  <pic:spPr>
+                    <a:xfrm>
+                      <a:off x="0" y="0"/>
+                      <a:ext cx="5943600" cy="4883150"/>
+                    </a:xfrm>
+                    <a:prstGeom prst="rect">
+                      <a:avLst/>
+                    </a:prstGeom>
+                  </pic:spPr>
+                </pic:pic>
+              </a:graphicData>
+            </a:graphic>
+          </wp:inline>
+        </w:drawing>
+      </w:r>
     </w:p>
     <w:p>
       <w:pPr>
@@ -508,6 +960,178 @@
           <w:bCs/>
         </w:rPr>
         <w:t>Screenshot B:</w:t>
+      </w:r>
+    </w:p>
+    <w:p>
+      <w:pPr>
+        <w:rPr>
+          <w:rFonts w:ascii="Times New Roman" w:hAnsi="Times New Roman" w:cs="Times New Roman"/>
+          <w:b/>
+          <w:bCs/>
+        </w:rPr>
+      </w:pPr>
+      <w:r>
+        <w:rPr>
+          <w:rFonts w:ascii="Times New Roman" w:hAnsi="Times New Roman" w:cs="Times New Roman"/>
+          <w:b/>
+          <w:bCs/>
+        </w:rPr>
+        <w:lastRenderedPageBreak/>
+        <w:drawing>
+          <wp:inline distT="0" distB="0" distL="0" distR="0" wp14:anchorId="78727A8F" wp14:editId="2C7B3275">
+            <wp:extent cx="5943600" cy="2974975"/>
+            <wp:effectExtent l="0" t="0" r="0" b="0"/>
+            <wp:docPr id="855805985" name="Picture 1"/>
+            <wp:cNvGraphicFramePr>
+              <a:graphicFrameLocks xmlns:a="http://schemas.openxmlformats.org/drawingml/2006/main" noChangeAspect="1"/>
+            </wp:cNvGraphicFramePr>
+            <a:graphic xmlns:a="http://schemas.openxmlformats.org/drawingml/2006/main">
+              <a:graphicData uri="http://schemas.openxmlformats.org/drawingml/2006/picture">
+                <pic:pic xmlns:pic="http://schemas.openxmlformats.org/drawingml/2006/picture">
+                  <pic:nvPicPr>
+                    <pic:cNvPr id="855805985" name=""/>
+                    <pic:cNvPicPr/>
+                  </pic:nvPicPr>
+                  <pic:blipFill>
+                    <a:blip r:embed="rId14"/>
+                    <a:stretch>
+                      <a:fillRect/>
+                    </a:stretch>
+                  </pic:blipFill>
+                  <pic:spPr>
+                    <a:xfrm>
+                      <a:off x="0" y="0"/>
+                      <a:ext cx="5943600" cy="2974975"/>
+                    </a:xfrm>
+                    <a:prstGeom prst="rect">
+                      <a:avLst/>
+                    </a:prstGeom>
+                  </pic:spPr>
+                </pic:pic>
+              </a:graphicData>
+            </a:graphic>
+          </wp:inline>
+        </w:drawing>
+      </w:r>
+    </w:p>
+    <w:p>
+      <w:pPr>
+        <w:rPr>
+          <w:rFonts w:ascii="Times New Roman" w:hAnsi="Times New Roman" w:cs="Times New Roman"/>
+          <w:b/>
+          <w:bCs/>
+        </w:rPr>
+      </w:pPr>
+      <w:r>
+        <w:rPr>
+          <w:rFonts w:ascii="Times New Roman" w:hAnsi="Times New Roman" w:cs="Times New Roman"/>
+          <w:b/>
+          <w:bCs/>
+        </w:rPr>
+        <w:drawing>
+          <wp:inline distT="0" distB="0" distL="0" distR="0" wp14:anchorId="2AF155A6" wp14:editId="61AC49C1">
+            <wp:extent cx="5943600" cy="2529840"/>
+            <wp:effectExtent l="0" t="0" r="0" b="3810"/>
+            <wp:docPr id="1816679" name="Picture 1"/>
+            <wp:cNvGraphicFramePr>
+              <a:graphicFrameLocks xmlns:a="http://schemas.openxmlformats.org/drawingml/2006/main" noChangeAspect="1"/>
+            </wp:cNvGraphicFramePr>
+            <a:graphic xmlns:a="http://schemas.openxmlformats.org/drawingml/2006/main">
+              <a:graphicData uri="http://schemas.openxmlformats.org/drawingml/2006/picture">
+                <pic:pic xmlns:pic="http://schemas.openxmlformats.org/drawingml/2006/picture">
+                  <pic:nvPicPr>
+                    <pic:cNvPr id="1816679" name=""/>
+                    <pic:cNvPicPr/>
+                  </pic:nvPicPr>
+                  <pic:blipFill rotWithShape="1">
+                    <a:blip r:embed="rId15"/>
+                    <a:srcRect t="5960" b="4087"/>
+                    <a:stretch>
+                      <a:fillRect/>
+                    </a:stretch>
+                  </pic:blipFill>
+                  <pic:spPr bwMode="auto">
+                    <a:xfrm>
+                      <a:off x="0" y="0"/>
+                      <a:ext cx="5943600" cy="2529840"/>
+                    </a:xfrm>
+                    <a:prstGeom prst="rect">
+                      <a:avLst/>
+                    </a:prstGeom>
+                    <a:ln>
+                      <a:noFill/>
+                    </a:ln>
+                    <a:extLst>
+                      <a:ext uri="{53640926-AAD7-44D8-BBD7-CCE9431645EC}">
+                        <a14:shadowObscured xmlns:a14="http://schemas.microsoft.com/office/drawing/2010/main"/>
+                      </a:ext>
+                    </a:extLst>
+                  </pic:spPr>
+                </pic:pic>
+              </a:graphicData>
+            </a:graphic>
+          </wp:inline>
+        </w:drawing>
+      </w:r>
+    </w:p>
+    <w:p>
+      <w:pPr>
+        <w:rPr>
+          <w:rFonts w:ascii="Times New Roman" w:hAnsi="Times New Roman" w:cs="Times New Roman"/>
+          <w:b/>
+          <w:bCs/>
+        </w:rPr>
+      </w:pPr>
+      <w:r>
+        <w:rPr>
+          <w:rFonts w:ascii="Times New Roman" w:hAnsi="Times New Roman" w:cs="Times New Roman"/>
+          <w:b/>
+          <w:bCs/>
+        </w:rPr>
+        <w:drawing>
+          <wp:inline distT="0" distB="0" distL="0" distR="0" wp14:anchorId="2F324430" wp14:editId="07E2AC01">
+            <wp:extent cx="5943600" cy="2458085"/>
+            <wp:effectExtent l="0" t="0" r="0" b="0"/>
+            <wp:docPr id="1982991030" name="Picture 1"/>
+            <wp:cNvGraphicFramePr>
+              <a:graphicFrameLocks xmlns:a="http://schemas.openxmlformats.org/drawingml/2006/main" noChangeAspect="1"/>
+            </wp:cNvGraphicFramePr>
+            <a:graphic xmlns:a="http://schemas.openxmlformats.org/drawingml/2006/main">
+              <a:graphicData uri="http://schemas.openxmlformats.org/drawingml/2006/picture">
+                <pic:pic xmlns:pic="http://schemas.openxmlformats.org/drawingml/2006/picture">
+                  <pic:nvPicPr>
+                    <pic:cNvPr id="1982991030" name=""/>
+                    <pic:cNvPicPr/>
+                  </pic:nvPicPr>
+                  <pic:blipFill rotWithShape="1">
+                    <a:blip r:embed="rId16"/>
+                    <a:srcRect t="5285"/>
+                    <a:stretch>
+                      <a:fillRect/>
+                    </a:stretch>
+                  </pic:blipFill>
+                  <pic:spPr bwMode="auto">
+                    <a:xfrm>
+                      <a:off x="0" y="0"/>
+                      <a:ext cx="5943600" cy="2458085"/>
+                    </a:xfrm>
+                    <a:prstGeom prst="rect">
+                      <a:avLst/>
+                    </a:prstGeom>
+                    <a:ln>
+                      <a:noFill/>
+                    </a:ln>
+                    <a:extLst>
+                      <a:ext uri="{53640926-AAD7-44D8-BBD7-CCE9431645EC}">
+                        <a14:shadowObscured xmlns:a14="http://schemas.microsoft.com/office/drawing/2010/main"/>
+                      </a:ext>
+                    </a:extLst>
+                  </pic:spPr>
+                </pic:pic>
+              </a:graphicData>
+            </a:graphic>
+          </wp:inline>
+        </w:drawing>
       </w:r>
     </w:p>
     <w:sectPr>
@@ -1524,6 +2148,29 @@
       <w:spacing w:val="5"/>
     </w:rPr>
   </w:style>
+  <w:style w:type="character" w:styleId="Hyperlink">
+    <w:name w:val="Hyperlink"/>
+    <w:basedOn w:val="DefaultParagraphFont"/>
+    <w:uiPriority w:val="99"/>
+    <w:unhideWhenUsed/>
+    <w:rsid w:val="0090157D"/>
+    <w:rPr>
+      <w:color w:val="467886" w:themeColor="hyperlink"/>
+      <w:u w:val="single"/>
+    </w:rPr>
+  </w:style>
+  <w:style w:type="character" w:styleId="UnresolvedMention">
+    <w:name w:val="Unresolved Mention"/>
+    <w:basedOn w:val="DefaultParagraphFont"/>
+    <w:uiPriority w:val="99"/>
+    <w:semiHidden/>
+    <w:unhideWhenUsed/>
+    <w:rsid w:val="0090157D"/>
+    <w:rPr>
+      <w:color w:val="605E5C"/>
+      <w:shd w:val="clear" w:color="auto" w:fill="E1DFDD"/>
+    </w:rPr>
+  </w:style>
 </w:styles>
 </file>
 
@@ -1820,4 +2467,213 @@
     </a:ext>
   </a:extLst>
 </a:theme>
+</file>
+
+<file path=customXml/item1.xml><?xml version="1.0" encoding="utf-8"?>
+<ct:contentTypeSchema xmlns:ct="http://schemas.microsoft.com/office/2006/metadata/contentType" xmlns:ma="http://schemas.microsoft.com/office/2006/metadata/properties/metaAttributes" ct:_="" ma:_="" ma:contentTypeName="Document" ma:contentTypeID="0x0101007FCF9F6B6B8E5946BAC289722222AF27" ma:contentTypeVersion="6" ma:contentTypeDescription="Create a new document." ma:contentTypeScope="" ma:versionID="af58be7a7d9365a713a09129d0b2c4fc">
+  <xsd:schema xmlns:xsd="http://www.w3.org/2001/XMLSchema" xmlns:xs="http://www.w3.org/2001/XMLSchema" xmlns:p="http://schemas.microsoft.com/office/2006/metadata/properties" xmlns:ns3="63b157e4-38ff-4f48-abb1-431b3c7d911a" targetNamespace="http://schemas.microsoft.com/office/2006/metadata/properties" ma:root="true" ma:fieldsID="600bbdf3fbaefa493995840530c5e351" ns3:_="">
+    <xsd:import namespace="63b157e4-38ff-4f48-abb1-431b3c7d911a"/>
+    <xsd:element name="properties">
+      <xsd:complexType>
+        <xsd:sequence>
+          <xsd:element name="documentManagement">
+            <xsd:complexType>
+              <xsd:all>
+                <xsd:element ref="ns3:MediaServiceMetadata" minOccurs="0"/>
+                <xsd:element ref="ns3:MediaServiceFastMetadata" minOccurs="0"/>
+                <xsd:element ref="ns3:MediaServiceSearchProperties" minOccurs="0"/>
+                <xsd:element ref="ns3:MediaServiceObjectDetectorVersions" minOccurs="0"/>
+                <xsd:element ref="ns3:MediaServiceDateTaken" minOccurs="0"/>
+                <xsd:element ref="ns3:_activity" minOccurs="0"/>
+              </xsd:all>
+            </xsd:complexType>
+          </xsd:element>
+        </xsd:sequence>
+      </xsd:complexType>
+    </xsd:element>
+  </xsd:schema>
+  <xsd:schema xmlns:xsd="http://www.w3.org/2001/XMLSchema" xmlns:xs="http://www.w3.org/2001/XMLSchema" xmlns:dms="http://schemas.microsoft.com/office/2006/documentManagement/types" xmlns:pc="http://schemas.microsoft.com/office/infopath/2007/PartnerControls" targetNamespace="63b157e4-38ff-4f48-abb1-431b3c7d911a" elementFormDefault="qualified">
+    <xsd:import namespace="http://schemas.microsoft.com/office/2006/documentManagement/types"/>
+    <xsd:import namespace="http://schemas.microsoft.com/office/infopath/2007/PartnerControls"/>
+    <xsd:element name="MediaServiceMetadata" ma:index="8" nillable="true" ma:displayName="MediaServiceMetadata" ma:hidden="true" ma:internalName="MediaServiceMetadata" ma:readOnly="true">
+      <xsd:simpleType>
+        <xsd:restriction base="dms:Note"/>
+      </xsd:simpleType>
+    </xsd:element>
+    <xsd:element name="MediaServiceFastMetadata" ma:index="9" nillable="true" ma:displayName="MediaServiceFastMetadata" ma:hidden="true" ma:internalName="MediaServiceFastMetadata" ma:readOnly="true">
+      <xsd:simpleType>
+        <xsd:restriction base="dms:Note"/>
+      </xsd:simpleType>
+    </xsd:element>
+    <xsd:element name="MediaServiceSearchProperties" ma:index="10" nillable="true" ma:displayName="MediaServiceSearchProperties" ma:hidden="true" ma:internalName="MediaServiceSearchProperties" ma:readOnly="true">
+      <xsd:simpleType>
+        <xsd:restriction base="dms:Note"/>
+      </xsd:simpleType>
+    </xsd:element>
+    <xsd:element name="MediaServiceObjectDetectorVersions" ma:index="11" nillable="true" ma:displayName="MediaServiceObjectDetectorVersions" ma:hidden="true" ma:indexed="true" ma:internalName="MediaServiceObjectDetectorVersions" ma:readOnly="true">
+      <xsd:simpleType>
+        <xsd:restriction base="dms:Text"/>
+      </xsd:simpleType>
+    </xsd:element>
+    <xsd:element name="MediaServiceDateTaken" ma:index="12" nillable="true" ma:displayName="MediaServiceDateTaken" ma:hidden="true" ma:indexed="true" ma:internalName="MediaServiceDateTaken" ma:readOnly="true">
+      <xsd:simpleType>
+        <xsd:restriction base="dms:Text"/>
+      </xsd:simpleType>
+    </xsd:element>
+    <xsd:element name="_activity" ma:index="13" nillable="true" ma:displayName="_activity" ma:hidden="true" ma:internalName="_activity">
+      <xsd:simpleType>
+        <xsd:restriction base="dms:Note"/>
+      </xsd:simpleType>
+    </xsd:element>
+  </xsd:schema>
+  <xsd:schema xmlns="http://schemas.openxmlformats.org/package/2006/metadata/core-properties" xmlns:xsd="http://www.w3.org/2001/XMLSchema" xmlns:xsi="http://www.w3.org/2001/XMLSchema-instance" xmlns:dc="http://purl.org/dc/elements/1.1/" xmlns:dcterms="http://purl.org/dc/terms/" xmlns:odoc="http://schemas.microsoft.com/internal/obd" targetNamespace="http://schemas.openxmlformats.org/package/2006/metadata/core-properties" elementFormDefault="qualified" attributeFormDefault="unqualified" blockDefault="#all">
+    <xsd:import namespace="http://purl.org/dc/elements/1.1/" schemaLocation="http://dublincore.org/schemas/xmls/qdc/2003/04/02/dc.xsd"/>
+    <xsd:import namespace="http://purl.org/dc/terms/" schemaLocation="http://dublincore.org/schemas/xmls/qdc/2003/04/02/dcterms.xsd"/>
+    <xsd:element name="coreProperties" type="CT_coreProperties"/>
+    <xsd:complexType name="CT_coreProperties">
+      <xsd:all>
+        <xsd:element ref="dc:creator" minOccurs="0" maxOccurs="1"/>
+        <xsd:element ref="dcterms:created" minOccurs="0" maxOccurs="1"/>
+        <xsd:element ref="dc:identifier" minOccurs="0" maxOccurs="1"/>
+        <xsd:element name="contentType" minOccurs="0" maxOccurs="1" type="xsd:string" ma:index="0" ma:displayName="Content Type"/>
+        <xsd:element ref="dc:title" minOccurs="0" maxOccurs="1" ma:index="4" ma:displayName="Title"/>
+        <xsd:element ref="dc:subject" minOccurs="0" maxOccurs="1"/>
+        <xsd:element ref="dc:description" minOccurs="0" maxOccurs="1"/>
+        <xsd:element name="keywords" minOccurs="0" maxOccurs="1" type="xsd:string"/>
+        <xsd:element ref="dc:language" minOccurs="0" maxOccurs="1"/>
+        <xsd:element name="category" minOccurs="0" maxOccurs="1" type="xsd:string"/>
+        <xsd:element name="version" minOccurs="0" maxOccurs="1" type="xsd:string"/>
+        <xsd:element name="revision" minOccurs="0" maxOccurs="1" type="xsd:string">
+          <xsd:annotation>
+            <xsd:documentation>
+                        This value indicates the number of saves or revisions. The application is responsible for updating this value after each revision.
+                    </xsd:documentation>
+          </xsd:annotation>
+        </xsd:element>
+        <xsd:element name="lastModifiedBy" minOccurs="0" maxOccurs="1" type="xsd:string"/>
+        <xsd:element ref="dcterms:modified" minOccurs="0" maxOccurs="1"/>
+        <xsd:element name="contentStatus" minOccurs="0" maxOccurs="1" type="xsd:string"/>
+      </xsd:all>
+    </xsd:complexType>
+  </xsd:schema>
+  <xs:schema xmlns:pc="http://schemas.microsoft.com/office/infopath/2007/PartnerControls" xmlns:xs="http://www.w3.org/2001/XMLSchema" targetNamespace="http://schemas.microsoft.com/office/infopath/2007/PartnerControls" elementFormDefault="qualified" attributeFormDefault="unqualified">
+    <xs:element name="Person">
+      <xs:complexType>
+        <xs:sequence>
+          <xs:element ref="pc:DisplayName" minOccurs="0"/>
+          <xs:element ref="pc:AccountId" minOccurs="0"/>
+          <xs:element ref="pc:AccountType" minOccurs="0"/>
+        </xs:sequence>
+      </xs:complexType>
+    </xs:element>
+    <xs:element name="DisplayName" type="xs:string"/>
+    <xs:element name="AccountId" type="xs:string"/>
+    <xs:element name="AccountType" type="xs:string"/>
+    <xs:element name="BDCAssociatedEntity">
+      <xs:complexType>
+        <xs:sequence>
+          <xs:element ref="pc:BDCEntity" minOccurs="0" maxOccurs="unbounded"/>
+        </xs:sequence>
+        <xs:attribute ref="pc:EntityNamespace"/>
+        <xs:attribute ref="pc:EntityName"/>
+        <xs:attribute ref="pc:SystemInstanceName"/>
+        <xs:attribute ref="pc:AssociationName"/>
+      </xs:complexType>
+    </xs:element>
+    <xs:attribute name="EntityNamespace" type="xs:string"/>
+    <xs:attribute name="EntityName" type="xs:string"/>
+    <xs:attribute name="SystemInstanceName" type="xs:string"/>
+    <xs:attribute name="AssociationName" type="xs:string"/>
+    <xs:element name="BDCEntity">
+      <xs:complexType>
+        <xs:sequence>
+          <xs:element ref="pc:EntityDisplayName" minOccurs="0"/>
+          <xs:element ref="pc:EntityInstanceReference" minOccurs="0"/>
+          <xs:element ref="pc:EntityId1" minOccurs="0"/>
+          <xs:element ref="pc:EntityId2" minOccurs="0"/>
+          <xs:element ref="pc:EntityId3" minOccurs="0"/>
+          <xs:element ref="pc:EntityId4" minOccurs="0"/>
+          <xs:element ref="pc:EntityId5" minOccurs="0"/>
+        </xs:sequence>
+      </xs:complexType>
+    </xs:element>
+    <xs:element name="EntityDisplayName" type="xs:string"/>
+    <xs:element name="EntityInstanceReference" type="xs:string"/>
+    <xs:element name="EntityId1" type="xs:string"/>
+    <xs:element name="EntityId2" type="xs:string"/>
+    <xs:element name="EntityId3" type="xs:string"/>
+    <xs:element name="EntityId4" type="xs:string"/>
+    <xs:element name="EntityId5" type="xs:string"/>
+    <xs:element name="Terms">
+      <xs:complexType>
+        <xs:sequence>
+          <xs:element ref="pc:TermInfo" minOccurs="0" maxOccurs="unbounded"/>
+        </xs:sequence>
+      </xs:complexType>
+    </xs:element>
+    <xs:element name="TermInfo">
+      <xs:complexType>
+        <xs:sequence>
+          <xs:element ref="pc:TermName" minOccurs="0"/>
+          <xs:element ref="pc:TermId" minOccurs="0"/>
+        </xs:sequence>
+      </xs:complexType>
+    </xs:element>
+    <xs:element name="TermName" type="xs:string"/>
+    <xs:element name="TermId" type="xs:string"/>
+  </xs:schema>
+</ct:contentTypeSchema>
+</file>
+
+<file path=customXml/item2.xml><?xml version="1.0" encoding="utf-8"?>
+<?mso-contentType ?>
+<FormTemplates xmlns="http://schemas.microsoft.com/sharepoint/v3/contenttype/forms">
+  <Display>DocumentLibraryForm</Display>
+  <Edit>DocumentLibraryForm</Edit>
+  <New>DocumentLibraryForm</New>
+</FormTemplates>
+</file>
+
+<file path=customXml/item3.xml><?xml version="1.0" encoding="utf-8"?>
+<p:properties xmlns:p="http://schemas.microsoft.com/office/2006/metadata/properties" xmlns:xsi="http://www.w3.org/2001/XMLSchema-instance" xmlns:pc="http://schemas.microsoft.com/office/infopath/2007/PartnerControls">
+  <documentManagement>
+    <_activity xmlns="63b157e4-38ff-4f48-abb1-431b3c7d911a" xsi:nil="true"/>
+  </documentManagement>
+</p:properties>
+</file>
+
+<file path=customXml/itemProps1.xml><?xml version="1.0" encoding="utf-8"?>
+<ds:datastoreItem xmlns:ds="http://schemas.openxmlformats.org/officeDocument/2006/customXml" ds:itemID="{3659C373-3B52-47CC-AE04-B2DB0EB2E4A1}">
+  <ds:schemaRefs>
+    <ds:schemaRef ds:uri="http://schemas.microsoft.com/office/2006/metadata/contentType"/>
+    <ds:schemaRef ds:uri="http://schemas.microsoft.com/office/2006/metadata/properties/metaAttributes"/>
+    <ds:schemaRef ds:uri="http://www.w3.org/2001/XMLSchema"/>
+    <ds:schemaRef ds:uri="http://schemas.microsoft.com/office/2006/metadata/properties"/>
+    <ds:schemaRef ds:uri="63b157e4-38ff-4f48-abb1-431b3c7d911a"/>
+    <ds:schemaRef ds:uri="http://schemas.microsoft.com/office/2006/documentManagement/types"/>
+    <ds:schemaRef ds:uri="http://schemas.microsoft.com/office/infopath/2007/PartnerControls"/>
+    <ds:schemaRef ds:uri="http://schemas.openxmlformats.org/package/2006/metadata/core-properties"/>
+    <ds:schemaRef ds:uri="http://purl.org/dc/elements/1.1/"/>
+    <ds:schemaRef ds:uri="http://purl.org/dc/terms/"/>
+    <ds:schemaRef ds:uri="http://schemas.microsoft.com/internal/obd"/>
+  </ds:schemaRefs>
+</ds:datastoreItem>
+</file>
+
+<file path=customXml/itemProps2.xml><?xml version="1.0" encoding="utf-8"?>
+<ds:datastoreItem xmlns:ds="http://schemas.openxmlformats.org/officeDocument/2006/customXml" ds:itemID="{D1B9A424-0D18-438B-A47B-AEB838018675}">
+  <ds:schemaRefs>
+    <ds:schemaRef ds:uri="http://schemas.microsoft.com/sharepoint/v3/contenttype/forms"/>
+  </ds:schemaRefs>
+</ds:datastoreItem>
+</file>
+
+<file path=customXml/itemProps3.xml><?xml version="1.0" encoding="utf-8"?>
+<ds:datastoreItem xmlns:ds="http://schemas.openxmlformats.org/officeDocument/2006/customXml" ds:itemID="{76463ABC-B746-4F0D-BC0F-FD4ADCAF4B4A}">
+  <ds:schemaRefs>
+    <ds:schemaRef ds:uri="http://schemas.microsoft.com/office/2006/metadata/properties"/>
+    <ds:schemaRef ds:uri="http://schemas.microsoft.com/office/infopath/2007/PartnerControls"/>
+    <ds:schemaRef ds:uri="63b157e4-38ff-4f48-abb1-431b3c7d911a"/>
+  </ds:schemaRefs>
+</ds:datastoreItem>
 </file>
</xml_diff>